<commit_message>
Add project groups (4 groups, 1 lady each) and update README
</commit_message>
<xml_diff>
--- a/Project_Groups_PEMRT525.docx
+++ b/Project_Groups_PEMRT525.docx
@@ -93,7 +93,7 @@
                 <w:sz w:val="24"/>
                 <w:szCs w:val="24"/>
               </w:rPr>
-              <w:t xml:space="preserve">Set B — Project Groups  |  Batch MR 2K24</w:t>
+              <w:t xml:space="preserve">Assignment Groups (Set A &amp; Set B)  |  Batch MR 2K24</w:t>
             </w:r>
           </w:p>
         </w:tc>
@@ -307,7 +307,7 @@
                 <w:sz w:val="20"/>
                 <w:szCs w:val="20"/>
               </w:rPr>
-              <w:t xml:space="preserve">Project</w:t>
+              <w:t xml:space="preserve">Assignment</w:t>
             </w:r>
           </w:p>
         </w:tc>
@@ -464,7 +464,7 @@
                 <w:sz w:val="21"/>
                 <w:szCs w:val="21"/>
               </w:rPr>
-              <w:t xml:space="preserve">B1</w:t>
+              <w:t xml:space="preserve">A1 + B1</w:t>
             </w:r>
           </w:p>
         </w:tc>
@@ -621,7 +621,7 @@
                 <w:sz w:val="21"/>
                 <w:szCs w:val="21"/>
               </w:rPr>
-              <w:t xml:space="preserve">B2</w:t>
+              <w:t xml:space="preserve">A2 + B2</w:t>
             </w:r>
           </w:p>
         </w:tc>
@@ -778,7 +778,7 @@
                 <w:sz w:val="21"/>
                 <w:szCs w:val="21"/>
               </w:rPr>
-              <w:t xml:space="preserve">B3</w:t>
+              <w:t xml:space="preserve">A3 + B3</w:t>
             </w:r>
           </w:p>
         </w:tc>
@@ -935,7 +935,7 @@
                 <w:sz w:val="21"/>
                 <w:szCs w:val="21"/>
               </w:rPr>
-              <w:t xml:space="preserve">B4</w:t>
+              <w:t xml:space="preserve">A4 + B4</w:t>
             </w:r>
           </w:p>
         </w:tc>
@@ -1189,7 +1189,7 @@
                 <w:sz w:val="20"/>
                 <w:szCs w:val="20"/>
               </w:rPr>
-              <w:t xml:space="preserve">• Each group must submit ONE project from Set B. Group number = Project number (Group 1 → B1, Group 2 → B2, etc.)</w:t>
+              <w:t xml:space="preserve">• Same groups apply to BOTH Set A and Set B. Group number = Assignment number (Group 1 → A1 + B1, Group 2 → A2 + B2, etc.)</w:t>
             </w:r>
           </w:p>
           <w:p>

</xml_diff>